<commit_message>
whatsapp group invites and booking instructions
</commit_message>
<xml_diff>
--- a/whatsapp group email.docx
+++ b/whatsapp group email.docx
@@ -8,12 +8,52 @@
       </w:r>
       <w:r>
         <w:rPr>
-          <w:rFonts w:ascii="Segoe UI Emoji" w:hAnsi="Segoe UI Emoji" w:cs="Segoe UI Emoji"/>
+          <w:noProof/>
         </w:rPr>
-        <w:t>🏓</w:t>
-      </w:r>
-      <w:r>
-        <w:t xml:space="preserve"> Join our WhatsApp Groups</w:t>
+        <w:drawing>
+          <wp:inline distT="0" distB="0" distL="0" distR="0" wp14:anchorId="1501509A" wp14:editId="4F6C3556">
+            <wp:extent cx="212090" cy="212090"/>
+            <wp:effectExtent l="0" t="0" r="0" b="0"/>
+            <wp:docPr id="1353568108" name="Picture 1"/>
+            <wp:cNvGraphicFramePr>
+              <a:graphicFrameLocks xmlns:a="http://schemas.openxmlformats.org/drawingml/2006/main" noChangeAspect="1"/>
+            </wp:cNvGraphicFramePr>
+            <a:graphic xmlns:a="http://schemas.openxmlformats.org/drawingml/2006/main">
+              <a:graphicData uri="http://schemas.openxmlformats.org/drawingml/2006/picture">
+                <pic:pic xmlns:pic="http://schemas.openxmlformats.org/drawingml/2006/picture">
+                  <pic:nvPicPr>
+                    <pic:cNvPr id="1353568108" name="Picture 1353568108"/>
+                    <pic:cNvPicPr/>
+                  </pic:nvPicPr>
+                  <pic:blipFill>
+                    <a:blip r:embed="rId5" cstate="print">
+                      <a:extLst>
+                        <a:ext uri="{28A0092B-C50C-407E-A947-70E740481C1C}">
+                          <a14:useLocalDpi xmlns:a14="http://schemas.microsoft.com/office/drawing/2010/main" val="0"/>
+                        </a:ext>
+                      </a:extLst>
+                    </a:blip>
+                    <a:stretch>
+                      <a:fillRect/>
+                    </a:stretch>
+                  </pic:blipFill>
+                  <pic:spPr>
+                    <a:xfrm flipH="1">
+                      <a:off x="0" y="0"/>
+                      <a:ext cx="212090" cy="212090"/>
+                    </a:xfrm>
+                    <a:prstGeom prst="rect">
+                      <a:avLst/>
+                    </a:prstGeom>
+                  </pic:spPr>
+                </pic:pic>
+              </a:graphicData>
+            </a:graphic>
+          </wp:inline>
+        </w:drawing>
+      </w:r>
+      <w:r>
+        <w:t>Join our WhatsApp Groups</w:t>
       </w:r>
     </w:p>
     <w:p>
@@ -28,7 +68,7 @@
     </w:p>
     <w:p>
       <w:r>
-        <w:t>Please click the links below on your mobile device to join the channels you wish to be a member of:</w:t>
+        <w:t>Please click the links below on your device to join the channels you wish to be a member of:</w:t>
       </w:r>
     </w:p>
     <w:p>
@@ -60,7 +100,25 @@
       </w:r>
       <w:proofErr w:type="gramEnd"/>
       <w:r>
-        <w:t>Insert WhatsApp Link)</w:t>
+        <w:fldChar w:fldCharType="begin"/>
+      </w:r>
+      <w:r>
+        <w:instrText>HYPERLINK "https://chat.whatsapp.com/D2Yd7tMhjZCBrBZKXO2Y6D"</w:instrText>
+      </w:r>
+      <w:r>
+        <w:fldChar w:fldCharType="separate"/>
+      </w:r>
+      <w:r>
+        <w:rPr>
+          <w:rStyle w:val="Hyperlink"/>
+        </w:rPr>
+        <w:t>Social/Chat WhatsApp Link</w:t>
+      </w:r>
+      <w:r>
+        <w:fldChar w:fldCharType="end"/>
+      </w:r>
+      <w:r>
+        <w:t>)</w:t>
       </w:r>
     </w:p>
     <w:p>
@@ -78,15 +136,52 @@
         <w:t>Pickleball Gloucestershire Graded Play:</w:t>
       </w:r>
       <w:r>
-        <w:t xml:space="preserve"> For players interested in the competitive game format where players are matched against opponents of similar skill levels based on live internal ratings. [Join the Graded Play </w:t>
+        <w:t xml:space="preserve"> For players interested in the </w:t>
+      </w:r>
+      <w:r>
+        <w:rPr>
+          <w:b/>
+          <w:bCs/>
+          <w:color w:val="EE0000"/>
+        </w:rPr>
+        <w:t>competitive</w:t>
+      </w:r>
+      <w:r>
+        <w:t xml:space="preserve"> game format where players are matched against opponents of similar skill levels based on live internal ratings. [Join the Graded Play </w:t>
       </w:r>
       <w:proofErr w:type="gramStart"/>
       <w:r>
         <w:t>Group](</w:t>
       </w:r>
+      <w:proofErr w:type="spellStart"/>
       <w:proofErr w:type="gramEnd"/>
       <w:r>
-        <w:t>Insert WhatsApp Link)</w:t>
+        <w:fldChar w:fldCharType="begin"/>
+      </w:r>
+      <w:r>
+        <w:instrText>HYPERLINK "https://chat.whatsapp.com/D6eBUdXfMSC840oPa16afU"</w:instrText>
+      </w:r>
+      <w:r>
+        <w:fldChar w:fldCharType="separate"/>
+      </w:r>
+      <w:r>
+        <w:rPr>
+          <w:rStyle w:val="Hyperlink"/>
+        </w:rPr>
+        <w:t>GradedPlay</w:t>
+      </w:r>
+      <w:proofErr w:type="spellEnd"/>
+      <w:r>
+        <w:rPr>
+          <w:rStyle w:val="Hyperlink"/>
+        </w:rPr>
+        <w:t xml:space="preserve"> WhatsApp Link</w:t>
+      </w:r>
+      <w:r>
+        <w:fldChar w:fldCharType="end"/>
+      </w:r>
+      <w:r>
+        <w:t>)</w:t>
       </w:r>
     </w:p>
     <w:p>
@@ -1059,6 +1154,7 @@
   <w:style w:type="character" w:default="1" w:styleId="DefaultParagraphFont">
     <w:name w:val="Default Paragraph Font"/>
     <w:uiPriority w:val="1"/>
+    <w:semiHidden/>
     <w:unhideWhenUsed/>
   </w:style>
   <w:style w:type="table" w:default="1" w:styleId="TableNormal">
@@ -1370,6 +1466,29 @@
       <w:smallCaps/>
       <w:color w:val="0F4761" w:themeColor="accent1" w:themeShade="BF"/>
       <w:spacing w:val="5"/>
+    </w:rPr>
+  </w:style>
+  <w:style w:type="character" w:styleId="Hyperlink">
+    <w:name w:val="Hyperlink"/>
+    <w:basedOn w:val="DefaultParagraphFont"/>
+    <w:uiPriority w:val="99"/>
+    <w:unhideWhenUsed/>
+    <w:rsid w:val="002771AA"/>
+    <w:rPr>
+      <w:color w:val="467886" w:themeColor="hyperlink"/>
+      <w:u w:val="single"/>
+    </w:rPr>
+  </w:style>
+  <w:style w:type="character" w:styleId="UnresolvedMention">
+    <w:name w:val="Unresolved Mention"/>
+    <w:basedOn w:val="DefaultParagraphFont"/>
+    <w:uiPriority w:val="99"/>
+    <w:semiHidden/>
+    <w:unhideWhenUsed/>
+    <w:rsid w:val="002771AA"/>
+    <w:rPr>
+      <w:color w:val="605E5C"/>
+      <w:shd w:val="clear" w:color="auto" w:fill="E1DFDD"/>
     </w:rPr>
   </w:style>
 </w:styles>

</xml_diff>